<commit_message>
updated with new layout
</commit_message>
<xml_diff>
--- a/documents/FuZhengCVwebsite.docx
+++ b/documents/FuZhengCVwebsite.docx
@@ -1142,7 +1142,19 @@
         <w:rPr>
           <w:rFonts w:eastAsia="Heiti TC Medium"/>
         </w:rPr>
-        <w:t xml:space="preserve">. “Missing Binds: How Absent Ties Unleash </w:t>
+        <w:t xml:space="preserve">. </w:t>
+      </w:r>
+      <w:r>
+        <w:rPr>
+          <w:rFonts w:eastAsia="Heiti TC Medium"/>
+        </w:rPr>
+        <w:t xml:space="preserve">2026. </w:t>
+      </w:r>
+      <w:r>
+        <w:rPr>
+          <w:rFonts w:eastAsia="Heiti TC Medium"/>
+        </w:rPr>
+        <w:t xml:space="preserve">“Missing Binds: How Absent Ties Unleash </w:t>
       </w:r>
       <w:r>
         <w:rPr>
@@ -1771,7 +1783,16 @@
           <w:iCs/>
         </w:rPr>
       </w:pPr>
-      <w:r>
+    </w:p>
+    <w:p>
+      <w:pPr>
+        <w:tabs>
+          <w:tab w:val="left" w:pos="360"/>
+          <w:tab w:val="left" w:pos="1080"/>
+        </w:tabs>
+        <w:spacing w:line="280" w:lineRule="exact"/>
+        <w:jc w:val="both"/>
+        <w:outlineLvl w:val="0"/>
         <w:rPr>
           <w:rFonts w:eastAsia="Heiti TC Medium"/>
           <w:b/>
@@ -1779,6 +1800,16 @@
           <w:i/>
           <w:iCs/>
         </w:rPr>
+      </w:pPr>
+      <w:r>
+        <w:rPr>
+          <w:rFonts w:eastAsia="Heiti TC Medium"/>
+          <w:b/>
+          <w:bCs/>
+          <w:i/>
+          <w:iCs/>
+        </w:rPr>
+        <w:lastRenderedPageBreak/>
         <w:t>Working Papers</w:t>
       </w:r>
     </w:p>
@@ -1982,7 +2013,39 @@
         <w:rPr>
           <w:rFonts w:eastAsia="Heiti TC Medium" w:hint="eastAsia"/>
         </w:rPr>
-        <w:t xml:space="preserve"> (Under Review)</w:t>
+        <w:t xml:space="preserve"> (</w:t>
+      </w:r>
+      <w:r>
+        <w:rPr>
+          <w:rFonts w:eastAsia="Heiti TC Medium"/>
+        </w:rPr>
+        <w:t>Re</w:t>
+      </w:r>
+      <w:r>
+        <w:rPr>
+          <w:rFonts w:eastAsia="Heiti TC Medium"/>
+        </w:rPr>
+        <w:t>vise</w:t>
+      </w:r>
+      <w:r>
+        <w:rPr>
+          <w:rFonts w:eastAsia="Heiti TC Medium"/>
+        </w:rPr>
+        <w:t xml:space="preserve"> and </w:t>
+      </w:r>
+      <w:proofErr w:type="gramStart"/>
+      <w:r>
+        <w:rPr>
+          <w:rFonts w:eastAsia="Heiti TC Medium"/>
+        </w:rPr>
+        <w:t>Resubmit</w:t>
+      </w:r>
+      <w:proofErr w:type="gramEnd"/>
+      <w:r>
+        <w:rPr>
+          <w:rFonts w:eastAsia="Heiti TC Medium" w:hint="eastAsia"/>
+        </w:rPr>
+        <w:t>)</w:t>
       </w:r>
       <w:r>
         <w:rPr>
@@ -2049,7 +2112,6 @@
         <w:outlineLvl w:val="0"/>
         <w:rPr>
           <w:rFonts w:eastAsia="Heiti TC Medium"/>
-          <w:lang w:eastAsia="en-US"/>
         </w:rPr>
       </w:pPr>
       <w:proofErr w:type="spellStart"/>
@@ -2140,7 +2202,83 @@
         <w:rPr>
           <w:rFonts w:eastAsia="Heiti TC Medium" w:hint="eastAsia"/>
         </w:rPr>
-        <w:t>(Manuscript under Preparation)</w:t>
+        <w:t>(</w:t>
+      </w:r>
+      <w:r>
+        <w:rPr>
+          <w:rFonts w:eastAsia="Heiti TC Medium"/>
+        </w:rPr>
+        <w:t>Under Review</w:t>
+      </w:r>
+      <w:r>
+        <w:rPr>
+          <w:rFonts w:eastAsia="Heiti TC Medium" w:hint="eastAsia"/>
+        </w:rPr>
+        <w:t>)</w:t>
+      </w:r>
+    </w:p>
+    <w:p>
+      <w:pPr>
+        <w:tabs>
+          <w:tab w:val="left" w:pos="360"/>
+          <w:tab w:val="left" w:pos="1080"/>
+        </w:tabs>
+        <w:spacing w:after="240" w:line="280" w:lineRule="exact"/>
+        <w:jc w:val="both"/>
+        <w:outlineLvl w:val="0"/>
+        <w:rPr>
+          <w:rFonts w:eastAsia="Heiti TC Medium"/>
+        </w:rPr>
+      </w:pPr>
+      <w:r>
+        <w:rPr>
+          <w:rFonts w:eastAsia="Heiti TC Medium"/>
+          <w:b/>
+          <w:bCs/>
+        </w:rPr>
+        <w:t>Zheng Fu</w:t>
+      </w:r>
+      <w:r>
+        <w:rPr>
+          <w:rFonts w:eastAsia="Heiti TC Medium" w:hint="eastAsia"/>
+        </w:rPr>
+        <w:t>, Mian Chen</w:t>
+      </w:r>
+      <w:r>
+        <w:rPr>
+          <w:rFonts w:eastAsia="Heiti TC Medium"/>
+        </w:rPr>
+        <w:t>. “</w:t>
+      </w:r>
+      <w:r>
+        <w:rPr>
+          <w:rFonts w:eastAsia="Heiti TC Medium" w:hint="eastAsia"/>
+        </w:rPr>
+        <w:t>Propaganda or Misinformation: T</w:t>
+      </w:r>
+      <w:r>
+        <w:rPr>
+          <w:rFonts w:eastAsia="Heiti TC Medium"/>
+        </w:rPr>
+        <w:t>h</w:t>
+      </w:r>
+      <w:r>
+        <w:rPr>
+          <w:rFonts w:eastAsia="Heiti TC Medium" w:hint="eastAsia"/>
+        </w:rPr>
+        <w:t>e Framing of the Misinformation Problem in U.S. Mainstream Media.</w:t>
+      </w:r>
+      <w:r>
+        <w:rPr>
+          <w:rFonts w:eastAsia="Heiti TC Medium"/>
+        </w:rPr>
+        <w:t>”</w:t>
+      </w:r>
+      <w:r>
+        <w:rPr>
+          <w:rFonts w:eastAsia="Heiti TC Medium"/>
+        </w:rPr>
+        <w:t xml:space="preserve"> (Under Review)</w:t>
       </w:r>
     </w:p>
     <w:p>
@@ -2337,76 +2475,6 @@
           <w:rFonts w:eastAsia="Heiti TC Medium" w:hint="eastAsia"/>
         </w:rPr>
         <w:t>The Imagined AI User: How Universities Govern AI Usage.</w:t>
-      </w:r>
-      <w:r>
-        <w:rPr>
-          <w:rFonts w:eastAsia="Heiti TC Medium"/>
-        </w:rPr>
-        <w:t>”</w:t>
-      </w:r>
-    </w:p>
-    <w:p>
-      <w:pPr>
-        <w:tabs>
-          <w:tab w:val="left" w:pos="360"/>
-          <w:tab w:val="left" w:pos="1080"/>
-        </w:tabs>
-        <w:spacing w:after="240" w:line="280" w:lineRule="exact"/>
-        <w:jc w:val="both"/>
-        <w:outlineLvl w:val="0"/>
-        <w:rPr>
-          <w:rFonts w:eastAsia="Heiti TC Medium"/>
-        </w:rPr>
-      </w:pPr>
-      <w:r>
-        <w:rPr>
-          <w:rFonts w:eastAsia="Heiti TC Medium"/>
-          <w:b/>
-          <w:bCs/>
-        </w:rPr>
-        <w:t>Zheng Fu</w:t>
-      </w:r>
-      <w:r>
-        <w:rPr>
-          <w:rFonts w:eastAsia="Heiti TC Medium" w:hint="eastAsia"/>
-        </w:rPr>
-        <w:t>, Mian Chen</w:t>
-      </w:r>
-      <w:r>
-        <w:rPr>
-          <w:rFonts w:eastAsia="Heiti TC Medium"/>
-        </w:rPr>
-        <w:t>. “</w:t>
-      </w:r>
-      <w:r>
-        <w:rPr>
-          <w:rFonts w:eastAsia="Heiti TC Medium" w:hint="eastAsia"/>
-        </w:rPr>
-        <w:t>Propaganda or Misinformation: T</w:t>
-      </w:r>
-      <w:r>
-        <w:rPr>
-          <w:rFonts w:eastAsia="Heiti TC Medium"/>
-        </w:rPr>
-        <w:t>h</w:t>
-      </w:r>
-      <w:r>
-        <w:rPr>
-          <w:rFonts w:eastAsia="Heiti TC Medium" w:hint="eastAsia"/>
-        </w:rPr>
-        <w:t xml:space="preserve">e Framing of the Misinformation Problem in </w:t>
-      </w:r>
-      <w:r>
-        <w:rPr>
-          <w:rFonts w:eastAsia="Heiti TC Medium" w:hint="eastAsia"/>
-        </w:rPr>
-        <w:t xml:space="preserve">U.S. </w:t>
-      </w:r>
-      <w:r>
-        <w:rPr>
-          <w:rFonts w:eastAsia="Heiti TC Medium" w:hint="eastAsia"/>
-        </w:rPr>
-        <w:t>Mainstream Media.</w:t>
       </w:r>
       <w:r>
         <w:rPr>
@@ -2789,6 +2857,156 @@
               <w:jc w:val="both"/>
               <w:rPr>
                 <w:rFonts w:eastAsia="Heiti TC Medium"/>
+                <w:bCs/>
+              </w:rPr>
+            </w:pPr>
+            <w:r>
+              <w:rPr>
+                <w:rFonts w:eastAsia="Heiti TC Medium"/>
+                <w:bCs/>
+              </w:rPr>
+              <w:t>2026</w:t>
+            </w:r>
+          </w:p>
+        </w:tc>
+        <w:tc>
+          <w:tcPr>
+            <w:tcW w:w="7735" w:type="dxa"/>
+          </w:tcPr>
+          <w:p>
+            <w:pPr>
+              <w:tabs>
+                <w:tab w:val="left" w:pos="360"/>
+                <w:tab w:val="left" w:pos="1080"/>
+                <w:tab w:val="left" w:pos="8640"/>
+              </w:tabs>
+              <w:spacing w:line="280" w:lineRule="exact"/>
+              <w:jc w:val="both"/>
+              <w:rPr>
+                <w:rFonts w:eastAsia="Heiti TC Medium"/>
+                <w:bCs/>
+              </w:rPr>
+            </w:pPr>
+            <w:r>
+              <w:rPr>
+                <w:rFonts w:eastAsia="Heiti TC Medium"/>
+                <w:bCs/>
+              </w:rPr>
+              <w:t>American Sociological Association, New York, NY</w:t>
+            </w:r>
+          </w:p>
+          <w:p>
+            <w:pPr>
+              <w:tabs>
+                <w:tab w:val="left" w:pos="360"/>
+                <w:tab w:val="left" w:pos="1080"/>
+                <w:tab w:val="left" w:pos="8640"/>
+              </w:tabs>
+              <w:spacing w:line="280" w:lineRule="exact"/>
+              <w:jc w:val="both"/>
+              <w:rPr>
+                <w:rFonts w:eastAsia="Heiti TC Medium"/>
+                <w:bCs/>
+                <w:i/>
+                <w:iCs/>
+              </w:rPr>
+            </w:pPr>
+            <w:r>
+              <w:rPr>
+                <w:rFonts w:eastAsia="Heiti TC Medium"/>
+                <w:bCs/>
+                <w:i/>
+                <w:iCs/>
+              </w:rPr>
+              <w:t xml:space="preserve">Presenting: </w:t>
+            </w:r>
+            <w:r>
+              <w:rPr>
+                <w:rFonts w:eastAsia="Heiti TC Medium"/>
+              </w:rPr>
+              <w:t>Power in the Loop: Algorithmic Governance and Legitimacy</w:t>
+            </w:r>
+            <w:r>
+              <w:rPr>
+                <w:rFonts w:eastAsia="Heiti TC Medium" w:hint="eastAsia"/>
+              </w:rPr>
+              <w:t xml:space="preserve"> under Authoritarianism</w:t>
+            </w:r>
+          </w:p>
+        </w:tc>
+      </w:tr>
+      <w:tr>
+        <w:tc>
+          <w:tcPr>
+            <w:tcW w:w="1615" w:type="dxa"/>
+          </w:tcPr>
+          <w:p>
+            <w:pPr>
+              <w:tabs>
+                <w:tab w:val="left" w:pos="360"/>
+                <w:tab w:val="left" w:pos="1080"/>
+                <w:tab w:val="left" w:pos="8640"/>
+              </w:tabs>
+              <w:spacing w:line="280" w:lineRule="exact"/>
+              <w:jc w:val="both"/>
+              <w:rPr>
+                <w:rFonts w:eastAsia="Heiti TC Medium"/>
+                <w:bCs/>
+              </w:rPr>
+            </w:pPr>
+            <w:r>
+              <w:rPr>
+                <w:rFonts w:eastAsia="Heiti TC Medium"/>
+                <w:bCs/>
+              </w:rPr>
+              <w:t>2025</w:t>
+            </w:r>
+          </w:p>
+        </w:tc>
+        <w:tc>
+          <w:tcPr>
+            <w:tcW w:w="7735" w:type="dxa"/>
+          </w:tcPr>
+          <w:p>
+            <w:pPr>
+              <w:tabs>
+                <w:tab w:val="left" w:pos="360"/>
+                <w:tab w:val="left" w:pos="1080"/>
+                <w:tab w:val="left" w:pos="8640"/>
+              </w:tabs>
+              <w:spacing w:line="280" w:lineRule="exact"/>
+              <w:jc w:val="both"/>
+              <w:rPr>
+                <w:rFonts w:eastAsia="Heiti TC Medium"/>
+                <w:bCs/>
+              </w:rPr>
+            </w:pPr>
+            <w:r>
+              <w:rPr>
+                <w:rFonts w:eastAsia="Heiti TC Medium"/>
+                <w:bCs/>
+              </w:rPr>
+              <w:t>American Sociological Association, Chicago, IL</w:t>
+            </w:r>
+          </w:p>
+        </w:tc>
+      </w:tr>
+      <w:tr>
+        <w:tc>
+          <w:tcPr>
+            <w:tcW w:w="1615" w:type="dxa"/>
+          </w:tcPr>
+          <w:p>
+            <w:pPr>
+              <w:tabs>
+                <w:tab w:val="left" w:pos="360"/>
+                <w:tab w:val="left" w:pos="1080"/>
+                <w:tab w:val="left" w:pos="8640"/>
+              </w:tabs>
+              <w:spacing w:line="280" w:lineRule="exact"/>
+              <w:jc w:val="both"/>
+              <w:rPr>
+                <w:rFonts w:eastAsia="Heiti TC Medium"/>
                 <w:b/>
                 <w:bCs/>
               </w:rPr>
@@ -3276,6 +3494,7 @@
                 <w:rFonts w:eastAsia="Heiti TC Medium"/>
                 <w:bCs/>
               </w:rPr>
+              <w:lastRenderedPageBreak/>
               <w:t>2022</w:t>
             </w:r>
           </w:p>
@@ -3496,7 +3715,6 @@
                 <w:bCs/>
                 <w:iCs/>
               </w:rPr>
-              <w:lastRenderedPageBreak/>
               <w:t>2017</w:t>
             </w:r>
           </w:p>
@@ -4513,7 +4731,7 @@
               <w:spacing w:line="280" w:lineRule="exact"/>
               <w:jc w:val="both"/>
               <w:rPr>
-                <w:rFonts w:eastAsia="Heiti TC Medium" w:hint="eastAsia"/>
+                <w:rFonts w:eastAsia="Heiti TC Medium"/>
                 <w:bCs/>
                 <w:i/>
                 <w:iCs/>
@@ -4566,7 +4784,7 @@
               <w:spacing w:line="280" w:lineRule="exact"/>
               <w:jc w:val="both"/>
               <w:rPr>
-                <w:rFonts w:eastAsia="Heiti TC Medium" w:hint="eastAsia"/>
+                <w:rFonts w:eastAsia="Heiti TC Medium"/>
                 <w:bCs/>
               </w:rPr>
             </w:pPr>
@@ -4666,7 +4884,7 @@
               <w:spacing w:line="280" w:lineRule="exact"/>
               <w:jc w:val="both"/>
               <w:rPr>
-                <w:rFonts w:eastAsia="Heiti TC Medium" w:hint="eastAsia"/>
+                <w:rFonts w:eastAsia="Heiti TC Medium"/>
                 <w:bCs/>
               </w:rPr>
             </w:pPr>
@@ -5226,6 +5444,7 @@
         <w:rPr>
           <w:rFonts w:eastAsia="Heiti TC Medium"/>
         </w:rPr>
+        <w:lastRenderedPageBreak/>
         <w:t>Coordinator of Interdisciplinary Graduate Student Seminar at Columbia University.</w:t>
       </w:r>
     </w:p>
@@ -5292,7 +5511,6 @@
         <w:rPr>
           <w:rFonts w:eastAsia="Heiti TC Medium" w:hint="eastAsia"/>
         </w:rPr>
-        <w:lastRenderedPageBreak/>
         <w:t>R</w:t>
       </w:r>
       <w:r>
@@ -5403,7 +5621,7 @@
         <v:path o:extrusionok="f" gradientshapeok="t" o:connecttype="rect"/>
         <o:lock v:ext="edit" aspectratio="t"/>
       </v:shapetype>
-      <v:shape id="_x0000_i1025" type="#_x0000_t75" style="width:12.55pt;height:12.55pt" o:bullet="t">
+      <v:shape id="_x0000_i1025" type="#_x0000_t75" style="width:12.85pt;height:12.85pt" o:bullet="t">
         <v:imagedata r:id="rId1" o:title="BD21302_"/>
       </v:shape>
     </w:pict>

</xml_diff>